<commit_message>
v2.2.0 — rapport: 5 colonnes quantités, événements 2.1/2.2, annexes photos, no. projet retiré
</commit_message>
<xml_diff>
--- a/assets/rapport-template.docx
+++ b/assets/rapport-template.docx
@@ -137,20 +137,6 @@
               <w:t xml:space="preserve">Chantier : [NOM DU CHANTIER]</w:t>
             </w:r>
           </w:p>
-          <w:p>
-            <w:pPr>
-              <w:jc w:val="right"/>
-            </w:pPr>
-            <w:r>
-              <w:rPr>
-                <w:rFonts w:ascii="Calibri" w:cs="Calibri" w:eastAsia="Calibri" w:hAnsi="Calibri"/>
-                <w:color w:val="1B2A4A"/>
-                <w:sz w:val="20"/>
-                <w:szCs w:val="20"/>
-              </w:rPr>
-              <w:t xml:space="preserve">No. projet : [NUMÉRO]</w:t>
-            </w:r>
-          </w:p>
         </w:tc>
       </w:tr>
     </w:tbl>
@@ -197,13 +183,13 @@
         </w:tblBorders>
       </w:tblPr>
       <w:tblGrid>
-        <w:gridCol w:w="2540"/>
-        <w:gridCol w:w="6530"/>
+        <w:gridCol w:w="3175"/>
+        <w:gridCol w:w="5895"/>
       </w:tblGrid>
       <w:tr>
         <w:tc>
           <w:tcPr>
-            <w:tcW w:type="dxa" w:w="2540"/>
+            <w:tcW w:type="dxa" w:w="3175"/>
             <w:tcBorders>
               <w:top w:val="none" w:color="FFFFFF" w:sz="0"/>
               <w:left w:val="none" w:color="FFFFFF" w:sz="0"/>
@@ -233,7 +219,7 @@
         </w:tc>
         <w:tc>
           <w:tcPr>
-            <w:tcW w:type="dxa" w:w="6530"/>
+            <w:tcW w:type="dxa" w:w="5895"/>
             <w:tcBorders>
               <w:top w:val="none" w:color="FFFFFF" w:sz="0"/>
               <w:left w:val="none" w:color="FFFFFF" w:sz="0"/>
@@ -262,7 +248,7 @@
       <w:tr>
         <w:tc>
           <w:tcPr>
-            <w:tcW w:type="dxa" w:w="2540"/>
+            <w:tcW w:type="dxa" w:w="3175"/>
             <w:tcBorders>
               <w:top w:val="none" w:color="FFFFFF" w:sz="0"/>
               <w:left w:val="none" w:color="FFFFFF" w:sz="0"/>
@@ -292,7 +278,7 @@
         </w:tc>
         <w:tc>
           <w:tcPr>
-            <w:tcW w:type="dxa" w:w="6530"/>
+            <w:tcW w:type="dxa" w:w="5895"/>
             <w:tcBorders>
               <w:top w:val="none" w:color="FFFFFF" w:sz="0"/>
               <w:left w:val="none" w:color="FFFFFF" w:sz="0"/>
@@ -321,7 +307,7 @@
       <w:tr>
         <w:tc>
           <w:tcPr>
-            <w:tcW w:type="dxa" w:w="2540"/>
+            <w:tcW w:type="dxa" w:w="3175"/>
             <w:tcBorders>
               <w:top w:val="none" w:color="FFFFFF" w:sz="0"/>
               <w:left w:val="none" w:color="FFFFFF" w:sz="0"/>
@@ -345,13 +331,13 @@
                 <w:sz w:val="18"/>
                 <w:szCs w:val="18"/>
               </w:rPr>
-              <w:t xml:space="preserve">No. contrat</w:t>
-            </w:r>
-          </w:p>
-        </w:tc>
-        <w:tc>
-          <w:tcPr>
-            <w:tcW w:type="dxa" w:w="6530"/>
+              <w:t xml:space="preserve">No. Projet Donneur d’ouvrage</w:t>
+            </w:r>
+          </w:p>
+        </w:tc>
+        <w:tc>
+          <w:tcPr>
+            <w:tcW w:type="dxa" w:w="5895"/>
             <w:tcBorders>
               <w:top w:val="none" w:color="FFFFFF" w:sz="0"/>
               <w:left w:val="none" w:color="FFFFFF" w:sz="0"/>
@@ -372,7 +358,66 @@
                 <w:sz w:val="18"/>
                 <w:szCs w:val="18"/>
               </w:rPr>
-              <w:t xml:space="preserve">[Numéro de contrat]</w:t>
+              <w:t xml:space="preserve">[Numéro]</w:t>
+            </w:r>
+          </w:p>
+        </w:tc>
+      </w:tr>
+      <w:tr>
+        <w:tc>
+          <w:tcPr>
+            <w:tcW w:type="dxa" w:w="3175"/>
+            <w:tcBorders>
+              <w:top w:val="none" w:color="FFFFFF" w:sz="0"/>
+              <w:left w:val="none" w:color="FFFFFF" w:sz="0"/>
+              <w:bottom w:val="none" w:color="FFFFFF" w:sz="0"/>
+              <w:right w:val="none" w:color="FFFFFF" w:sz="0"/>
+            </w:tcBorders>
+            <w:tcMar>
+              <w:top w:type="dxa" w:w="60"/>
+              <w:left w:type="dxa" w:w="120"/>
+              <w:bottom w:type="dxa" w:w="60"/>
+              <w:right w:type="dxa" w:w="80"/>
+            </w:tcMar>
+          </w:tcPr>
+          <w:p>
+            <w:r>
+              <w:rPr>
+                <w:rFonts w:ascii="Calibri" w:cs="Calibri" w:eastAsia="Calibri" w:hAnsi="Calibri"/>
+                <w:b/>
+                <w:bCs/>
+                <w:color w:val="1B2A4A"/>
+                <w:sz w:val="18"/>
+                <w:szCs w:val="18"/>
+              </w:rPr>
+              <w:t xml:space="preserve">No. Projet Client</w:t>
+            </w:r>
+          </w:p>
+        </w:tc>
+        <w:tc>
+          <w:tcPr>
+            <w:tcW w:type="dxa" w:w="5895"/>
+            <w:tcBorders>
+              <w:top w:val="none" w:color="FFFFFF" w:sz="0"/>
+              <w:left w:val="none" w:color="FFFFFF" w:sz="0"/>
+              <w:bottom w:val="none" w:color="FFFFFF" w:sz="0"/>
+              <w:right w:val="none" w:color="FFFFFF" w:sz="0"/>
+            </w:tcBorders>
+            <w:tcMar>
+              <w:top w:type="dxa" w:w="60"/>
+              <w:left w:type="dxa" w:w="80"/>
+              <w:bottom w:type="dxa" w:w="60"/>
+              <w:right w:type="dxa" w:w="120"/>
+            </w:tcMar>
+          </w:tcPr>
+          <w:p>
+            <w:r>
+              <w:rPr>
+                <w:rFonts w:ascii="Calibri" w:cs="Calibri" w:eastAsia="Calibri" w:hAnsi="Calibri"/>
+                <w:sz w:val="18"/>
+                <w:szCs w:val="18"/>
+              </w:rPr>
+              <w:t xml:space="preserve">[Numéro]</w:t>
             </w:r>
           </w:p>
         </w:tc>
@@ -605,7 +650,7 @@
                 <w:sz w:val="22"/>
                 <w:szCs w:val="22"/>
               </w:rPr>
-              <w:t xml:space="preserve">2.  ÉVÉNEMENTS</w:t>
+              <w:t xml:space="preserve">2.  ÉVÉNEMENTS ET/OU COMMENTAIRES</w:t>
             </w:r>
           </w:p>
         </w:tc>
@@ -621,7 +666,7 @@
         <w:pBdr>
           <w:left w:val="single" w:color="C0392B" w:sz="18" w:space="8"/>
         </w:pBdr>
-        <w:spacing w:after="60" w:before="60"/>
+        <w:spacing w:after="40" w:before="100"/>
         <w:ind w:left="200"/>
       </w:pPr>
       <w:r>
@@ -630,41 +675,153 @@
           <w:b/>
           <w:bCs/>
           <w:color w:val="1B2A4A"/>
-          <w:sz w:val="20"/>
-          <w:szCs w:val="20"/>
-        </w:rPr>
-        <w:t xml:space="preserve">[11:20] Bris de conduite souterraine</w:t>
-      </w:r>
+          <w:sz w:val="21"/>
+          <w:szCs w:val="21"/>
+        </w:rPr>
+        <w:t xml:space="preserve">2.1  Bris de conduite souterraine</w:t>
+      </w:r>
+    </w:p>
+    <w:p>
+      <w:pPr>
+        <w:spacing w:after="40" w:before="0"/>
+        <w:ind w:left="200"/>
+      </w:pPr>
       <w:r>
         <w:rPr>
           <w:rFonts w:ascii="Calibri" w:cs="Calibri" w:eastAsia="Calibri" w:hAnsi="Calibri"/>
-          <w:sz w:val="20"/>
-          <w:szCs w:val="20"/>
-        </w:rPr>
-        <w:br/>
-        <w:t xml:space="preserve">
-Emplacement : Intersection Boyer / Rosemont</w:t>
+          <w:b/>
+          <w:bCs/>
+          <w:sz w:val="19"/>
+          <w:szCs w:val="19"/>
+        </w:rPr>
+        <w:t xml:space="preserve">Emplacement : </w:t>
       </w:r>
       <w:r>
         <w:rPr>
           <w:rFonts w:ascii="Calibri" w:cs="Calibri" w:eastAsia="Calibri" w:hAnsi="Calibri"/>
-          <w:sz w:val="20"/>
-          <w:szCs w:val="20"/>
-        </w:rPr>
-        <w:br/>
-        <w:t xml:space="preserve">
-Description : Conduite d’eau municipale touchée lors des excavations. MTQ avisé immédiatement. Travaux suspendus dans ce secteur.</w:t>
-      </w:r>
+          <w:sz w:val="19"/>
+          <w:szCs w:val="19"/>
+        </w:rPr>
+        <w:t xml:space="preserve">Intersection Boyer / Rosemont</w:t>
+      </w:r>
+    </w:p>
+    <w:p>
+      <w:pPr>
+        <w:spacing w:after="40" w:before="0"/>
+        <w:ind w:left="200"/>
+      </w:pPr>
       <w:r>
         <w:rPr>
           <w:rFonts w:ascii="Calibri" w:cs="Calibri" w:eastAsia="Calibri" w:hAnsi="Calibri"/>
+          <w:b/>
+          <w:bCs/>
+          <w:sz w:val="19"/>
+          <w:szCs w:val="19"/>
+        </w:rPr>
+        <w:t xml:space="preserve">Description : </w:t>
+      </w:r>
+      <w:r>
+        <w:rPr>
+          <w:rFonts w:ascii="Calibri" w:cs="Calibri" w:eastAsia="Calibri" w:hAnsi="Calibri"/>
+          <w:sz w:val="19"/>
+          <w:szCs w:val="19"/>
+        </w:rPr>
+        <w:t xml:space="preserve">Conduite d’eau municipale touchée lors des excavations. MTQ avisé immédiatement. Travaux suspendus dans ce secteur.</w:t>
+      </w:r>
+    </w:p>
+    <w:p>
+      <w:pPr>
+        <w:spacing w:after="60" w:before="0"/>
+        <w:ind w:left="200"/>
+      </w:pPr>
+      <w:r>
+        <w:rPr>
+          <w:rFonts w:ascii="Calibri" w:cs="Calibri" w:eastAsia="Calibri" w:hAnsi="Calibri"/>
+          <w:b/>
+          <w:bCs/>
+          <w:sz w:val="19"/>
+          <w:szCs w:val="19"/>
+        </w:rPr>
+        <w:t xml:space="preserve">Photos : </w:t>
+      </w:r>
+      <w:r>
+        <w:rPr>
+          <w:rFonts w:ascii="Calibri" w:cs="Calibri" w:eastAsia="Calibri" w:hAnsi="Calibri"/>
+          <w:i/>
+          <w:iCs/>
           <w:color w:val="666666"/>
-          <w:sz w:val="20"/>
-          <w:szCs w:val="20"/>
-        </w:rPr>
-        <w:br/>
-        <w:t xml:space="preserve">
-Photos : oui — 3 photo(s) jointe(s)</w:t>
+          <w:sz w:val="19"/>
+          <w:szCs w:val="19"/>
+        </w:rPr>
+        <w:t xml:space="preserve">Voir Annexe A — Événement 2.1 Bris de conduite souterraine</w:t>
+      </w:r>
+    </w:p>
+    <w:p>
+      <w:pPr>
+        <w:pBdr>
+          <w:left w:val="single" w:color="C0392B" w:sz="18" w:space="8"/>
+        </w:pBdr>
+        <w:spacing w:after="40" w:before="100"/>
+        <w:ind w:left="200"/>
+      </w:pPr>
+      <w:r>
+        <w:rPr>
+          <w:rFonts w:ascii="Calibri" w:cs="Calibri" w:eastAsia="Calibri" w:hAnsi="Calibri"/>
+          <w:b/>
+          <w:bCs/>
+          <w:color w:val="1B2A4A"/>
+          <w:sz w:val="21"/>
+          <w:szCs w:val="21"/>
+        </w:rPr>
+        <w:t xml:space="preserve">2.2  Retard livraison matériaux</w:t>
+      </w:r>
+    </w:p>
+    <w:p>
+      <w:pPr>
+        <w:spacing w:after="40" w:before="0"/>
+        <w:ind w:left="200"/>
+      </w:pPr>
+      <w:r>
+        <w:rPr>
+          <w:rFonts w:ascii="Calibri" w:cs="Calibri" w:eastAsia="Calibri" w:hAnsi="Calibri"/>
+          <w:b/>
+          <w:bCs/>
+          <w:sz w:val="19"/>
+          <w:szCs w:val="19"/>
+        </w:rPr>
+        <w:t xml:space="preserve">Emplacement : </w:t>
+      </w:r>
+      <w:r>
+        <w:rPr>
+          <w:rFonts w:ascii="Calibri" w:cs="Calibri" w:eastAsia="Calibri" w:hAnsi="Calibri"/>
+          <w:sz w:val="19"/>
+          <w:szCs w:val="19"/>
+        </w:rPr>
+        <w:t xml:space="preserve">Zone de dépôt, secteur sud</w:t>
+      </w:r>
+    </w:p>
+    <w:p>
+      <w:pPr>
+        <w:spacing w:after="40" w:before="0"/>
+        <w:ind w:left="200"/>
+      </w:pPr>
+      <w:r>
+        <w:rPr>
+          <w:rFonts w:ascii="Calibri" w:cs="Calibri" w:eastAsia="Calibri" w:hAnsi="Calibri"/>
+          <w:b/>
+          <w:bCs/>
+          <w:sz w:val="19"/>
+          <w:szCs w:val="19"/>
+        </w:rPr>
+        <w:t xml:space="preserve">Description : </w:t>
+      </w:r>
+      <w:r>
+        <w:rPr>
+          <w:rFonts w:ascii="Calibri" w:cs="Calibri" w:eastAsia="Calibri" w:hAnsi="Calibri"/>
+          <w:sz w:val="19"/>
+          <w:szCs w:val="19"/>
+        </w:rPr>
+        <w:t xml:space="preserve">Camion de granulats arrivé avec 2h de retard. Impact sur le planning de la journée.</w:t>
       </w:r>
     </w:p>
     <w:p>
@@ -715,7 +872,7 @@
                 <w:sz w:val="22"/>
                 <w:szCs w:val="22"/>
               </w:rPr>
-              <w:t xml:space="preserve">3.  QUANTITÉS FACTURABLES</w:t>
+              <w:t xml:space="preserve">3.  QUANTITÉS</w:t>
             </w:r>
           </w:p>
         </w:tc>
@@ -739,14 +896,16 @@
         </w:tblBorders>
       </w:tblPr>
       <w:tblGrid>
+        <w:gridCol w:w="2000"/>
+        <w:gridCol w:w="1600"/>
+        <w:gridCol w:w="3270"/>
+        <w:gridCol w:w="1000"/>
         <w:gridCol w:w="1200"/>
-        <w:gridCol w:w="6270"/>
-        <w:gridCol w:w="1600"/>
       </w:tblGrid>
       <w:tr>
         <w:tc>
           <w:tcPr>
-            <w:tcW w:type="dxa" w:w="1200"/>
+            <w:tcW w:type="dxa" w:w="2000"/>
             <w:tcBorders>
               <w:top w:val="single" w:color="1B2A4A" w:sz="4"/>
               <w:left w:val="none" w:color="FFFFFF" w:sz="0"/>
@@ -771,13 +930,13 @@
                 <w:sz w:val="18"/>
                 <w:szCs w:val="18"/>
               </w:rPr>
-              <w:t xml:space="preserve">Heure</w:t>
-            </w:r>
-          </w:p>
-        </w:tc>
-        <w:tc>
-          <w:tcPr>
-            <w:tcW w:type="dxa" w:w="6270"/>
+              <w:t xml:space="preserve">Entrepreneur</w:t>
+            </w:r>
+          </w:p>
+        </w:tc>
+        <w:tc>
+          <w:tcPr>
+            <w:tcW w:type="dxa" w:w="1600"/>
             <w:tcBorders>
               <w:top w:val="single" w:color="1B2A4A" w:sz="4"/>
               <w:left w:val="none" w:color="FFFFFF" w:sz="0"/>
@@ -802,13 +961,13 @@
                 <w:sz w:val="18"/>
                 <w:szCs w:val="18"/>
               </w:rPr>
-              <w:t xml:space="preserve">Item</w:t>
-            </w:r>
-          </w:p>
-        </w:tc>
-        <w:tc>
-          <w:tcPr>
-            <w:tcW w:type="dxa" w:w="1600"/>
+              <w:t xml:space="preserve">Discipline</w:t>
+            </w:r>
+          </w:p>
+        </w:tc>
+        <w:tc>
+          <w:tcPr>
+            <w:tcW w:type="dxa" w:w="3270"/>
             <w:tcBorders>
               <w:top w:val="single" w:color="1B2A4A" w:sz="4"/>
               <w:left w:val="none" w:color="FFFFFF" w:sz="0"/>
@@ -833,7 +992,69 @@
                 <w:sz w:val="18"/>
                 <w:szCs w:val="18"/>
               </w:rPr>
-              <w:t xml:space="preserve">Quantité</w:t>
+              <w:t xml:space="preserve">Item</w:t>
+            </w:r>
+          </w:p>
+        </w:tc>
+        <w:tc>
+          <w:tcPr>
+            <w:tcW w:type="dxa" w:w="1000"/>
+            <w:tcBorders>
+              <w:top w:val="single" w:color="1B2A4A" w:sz="4"/>
+              <w:left w:val="none" w:color="FFFFFF" w:sz="0"/>
+              <w:bottom w:val="single" w:color="1B2A4A" w:sz="4"/>
+              <w:right w:val="none" w:color="FFFFFF" w:sz="0"/>
+            </w:tcBorders>
+            <w:shd w:fill="E8ECF2" w:val="clear"/>
+            <w:tcMar>
+              <w:top w:type="dxa" w:w="80"/>
+              <w:left w:type="dxa" w:w="120"/>
+              <w:bottom w:type="dxa" w:w="80"/>
+              <w:right w:type="dxa" w:w="120"/>
+            </w:tcMar>
+          </w:tcPr>
+          <w:p>
+            <w:r>
+              <w:rPr>
+                <w:rFonts w:ascii="Calibri" w:cs="Calibri" w:eastAsia="Calibri" w:hAnsi="Calibri"/>
+                <w:b/>
+                <w:bCs/>
+                <w:color w:val="1B2A4A"/>
+                <w:sz w:val="18"/>
+                <w:szCs w:val="18"/>
+              </w:rPr>
+              <w:t xml:space="preserve">Qté</w:t>
+            </w:r>
+          </w:p>
+        </w:tc>
+        <w:tc>
+          <w:tcPr>
+            <w:tcW w:type="dxa" w:w="1200"/>
+            <w:tcBorders>
+              <w:top w:val="single" w:color="1B2A4A" w:sz="4"/>
+              <w:left w:val="none" w:color="FFFFFF" w:sz="0"/>
+              <w:bottom w:val="single" w:color="1B2A4A" w:sz="4"/>
+              <w:right w:val="none" w:color="FFFFFF" w:sz="0"/>
+            </w:tcBorders>
+            <w:shd w:fill="E8ECF2" w:val="clear"/>
+            <w:tcMar>
+              <w:top w:type="dxa" w:w="80"/>
+              <w:left w:type="dxa" w:w="120"/>
+              <w:bottom w:type="dxa" w:w="80"/>
+              <w:right w:type="dxa" w:w="120"/>
+            </w:tcMar>
+          </w:tcPr>
+          <w:p>
+            <w:r>
+              <w:rPr>
+                <w:rFonts w:ascii="Calibri" w:cs="Calibri" w:eastAsia="Calibri" w:hAnsi="Calibri"/>
+                <w:b/>
+                <w:bCs/>
+                <w:color w:val="1B2A4A"/>
+                <w:sz w:val="18"/>
+                <w:szCs w:val="18"/>
+              </w:rPr>
+              <w:t xml:space="preserve">Unité</w:t>
             </w:r>
           </w:p>
         </w:tc>
@@ -841,7 +1062,7 @@
       <w:tr>
         <w:tc>
           <w:tcPr>
-            <w:tcW w:type="dxa" w:w="1200"/>
+            <w:tcW w:type="dxa" w:w="2000"/>
             <w:tcBorders>
               <w:top w:val="single" w:color="CCCCCC" w:sz="2"/>
               <w:left w:val="none" w:color="FFFFFF" w:sz="0"/>
@@ -864,13 +1085,13 @@
                 <w:sz w:val="18"/>
                 <w:szCs w:val="18"/>
               </w:rPr>
-              <w:t xml:space="preserve">08:15</w:t>
-            </w:r>
-          </w:p>
-        </w:tc>
-        <w:tc>
-          <w:tcPr>
-            <w:tcW w:type="dxa" w:w="6270"/>
+              <w:t xml:space="preserve">Maestro</w:t>
+            </w:r>
+          </w:p>
+        </w:tc>
+        <w:tc>
+          <w:tcPr>
+            <w:tcW w:type="dxa" w:w="1600"/>
             <w:tcBorders>
               <w:top w:val="single" w:color="CCCCCC" w:sz="2"/>
               <w:left w:val="none" w:color="FFFFFF" w:sz="0"/>
@@ -893,13 +1114,13 @@
                 <w:sz w:val="18"/>
                 <w:szCs w:val="18"/>
               </w:rPr>
-              <w:t xml:space="preserve">FC Boulevard Saint-Laurent — secteur nord</w:t>
-            </w:r>
-          </w:p>
-        </w:tc>
-        <w:tc>
-          <w:tcPr>
-            <w:tcW w:type="dxa" w:w="1600"/>
+              <w:t xml:space="preserve">Signalisation</w:t>
+            </w:r>
+          </w:p>
+        </w:tc>
+        <w:tc>
+          <w:tcPr>
+            <w:tcW w:type="dxa" w:w="3270"/>
             <w:tcBorders>
               <w:top w:val="single" w:color="CCCCCC" w:sz="2"/>
               <w:left w:val="none" w:color="FFFFFF" w:sz="0"/>
@@ -922,7 +1143,65 @@
                 <w:sz w:val="18"/>
                 <w:szCs w:val="18"/>
               </w:rPr>
-              <w:t xml:space="preserve">320 m</w:t>
+              <w:t xml:space="preserve">FC Boulevard Saint-Laurent — secteur nord</w:t>
+            </w:r>
+          </w:p>
+        </w:tc>
+        <w:tc>
+          <w:tcPr>
+            <w:tcW w:type="dxa" w:w="1000"/>
+            <w:tcBorders>
+              <w:top w:val="single" w:color="CCCCCC" w:sz="2"/>
+              <w:left w:val="none" w:color="FFFFFF" w:sz="0"/>
+              <w:bottom w:val="single" w:color="CCCCCC" w:sz="2"/>
+              <w:right w:val="none" w:color="FFFFFF" w:sz="0"/>
+            </w:tcBorders>
+            <w:tcMar>
+              <w:top w:type="dxa" w:w="60"/>
+              <w:left w:type="dxa" w:w="120"/>
+              <w:bottom w:type="dxa" w:w="60"/>
+              <w:right w:type="dxa" w:w="120"/>
+            </w:tcMar>
+          </w:tcPr>
+          <w:p>
+            <w:r>
+              <w:rPr>
+                <w:rFonts w:ascii="Calibri" w:cs="Calibri" w:eastAsia="Calibri" w:hAnsi="Calibri"/>
+                <w:b w:val="false"/>
+                <w:bCs w:val="false"/>
+                <w:sz w:val="18"/>
+                <w:szCs w:val="18"/>
+              </w:rPr>
+              <w:t xml:space="preserve">320</w:t>
+            </w:r>
+          </w:p>
+        </w:tc>
+        <w:tc>
+          <w:tcPr>
+            <w:tcW w:type="dxa" w:w="1200"/>
+            <w:tcBorders>
+              <w:top w:val="single" w:color="CCCCCC" w:sz="2"/>
+              <w:left w:val="none" w:color="FFFFFF" w:sz="0"/>
+              <w:bottom w:val="single" w:color="CCCCCC" w:sz="2"/>
+              <w:right w:val="none" w:color="FFFFFF" w:sz="0"/>
+            </w:tcBorders>
+            <w:tcMar>
+              <w:top w:type="dxa" w:w="60"/>
+              <w:left w:type="dxa" w:w="120"/>
+              <w:bottom w:type="dxa" w:w="60"/>
+              <w:right w:type="dxa" w:w="120"/>
+            </w:tcMar>
+          </w:tcPr>
+          <w:p>
+            <w:r>
+              <w:rPr>
+                <w:rFonts w:ascii="Calibri" w:cs="Calibri" w:eastAsia="Calibri" w:hAnsi="Calibri"/>
+                <w:b w:val="false"/>
+                <w:bCs w:val="false"/>
+                <w:sz w:val="18"/>
+                <w:szCs w:val="18"/>
+              </w:rPr>
+              <w:t xml:space="preserve">m</w:t>
             </w:r>
           </w:p>
         </w:tc>
@@ -930,7 +1209,7 @@
       <w:tr>
         <w:tc>
           <w:tcPr>
-            <w:tcW w:type="dxa" w:w="1200"/>
+            <w:tcW w:type="dxa" w:w="2000"/>
             <w:tcBorders>
               <w:top w:val="single" w:color="CCCCCC" w:sz="2"/>
               <w:left w:val="none" w:color="FFFFFF" w:sz="0"/>
@@ -953,13 +1232,13 @@
                 <w:sz w:val="18"/>
                 <w:szCs w:val="18"/>
               </w:rPr>
-              <w:t xml:space="preserve">10:45</w:t>
-            </w:r>
-          </w:p>
-        </w:tc>
-        <w:tc>
-          <w:tcPr>
-            <w:tcW w:type="dxa" w:w="6270"/>
+              <w:t xml:space="preserve">Maestro</w:t>
+            </w:r>
+          </w:p>
+        </w:tc>
+        <w:tc>
+          <w:tcPr>
+            <w:tcW w:type="dxa" w:w="1600"/>
             <w:tcBorders>
               <w:top w:val="single" w:color="CCCCCC" w:sz="2"/>
               <w:left w:val="none" w:color="FFFFFF" w:sz="0"/>
@@ -982,13 +1261,13 @@
                 <w:sz w:val="18"/>
                 <w:szCs w:val="18"/>
               </w:rPr>
-              <w:t xml:space="preserve">Signalisation type B</w:t>
-            </w:r>
-          </w:p>
-        </w:tc>
-        <w:tc>
-          <w:tcPr>
-            <w:tcW w:type="dxa" w:w="1600"/>
+              <w:t xml:space="preserve">Signalisation</w:t>
+            </w:r>
+          </w:p>
+        </w:tc>
+        <w:tc>
+          <w:tcPr>
+            <w:tcW w:type="dxa" w:w="3270"/>
             <w:tcBorders>
               <w:top w:val="single" w:color="CCCCCC" w:sz="2"/>
               <w:left w:val="none" w:color="FFFFFF" w:sz="0"/>
@@ -1011,7 +1290,65 @@
                 <w:sz w:val="18"/>
                 <w:szCs w:val="18"/>
               </w:rPr>
-              <w:t xml:space="preserve">45 unités</w:t>
+              <w:t xml:space="preserve">Panneaux type B</w:t>
+            </w:r>
+          </w:p>
+        </w:tc>
+        <w:tc>
+          <w:tcPr>
+            <w:tcW w:type="dxa" w:w="1000"/>
+            <w:tcBorders>
+              <w:top w:val="single" w:color="CCCCCC" w:sz="2"/>
+              <w:left w:val="none" w:color="FFFFFF" w:sz="0"/>
+              <w:bottom w:val="single" w:color="CCCCCC" w:sz="2"/>
+              <w:right w:val="none" w:color="FFFFFF" w:sz="0"/>
+            </w:tcBorders>
+            <w:tcMar>
+              <w:top w:type="dxa" w:w="60"/>
+              <w:left w:type="dxa" w:w="120"/>
+              <w:bottom w:type="dxa" w:w="60"/>
+              <w:right w:type="dxa" w:w="120"/>
+            </w:tcMar>
+          </w:tcPr>
+          <w:p>
+            <w:r>
+              <w:rPr>
+                <w:rFonts w:ascii="Calibri" w:cs="Calibri" w:eastAsia="Calibri" w:hAnsi="Calibri"/>
+                <w:b w:val="false"/>
+                <w:bCs w:val="false"/>
+                <w:sz w:val="18"/>
+                <w:szCs w:val="18"/>
+              </w:rPr>
+              <w:t xml:space="preserve">45</w:t>
+            </w:r>
+          </w:p>
+        </w:tc>
+        <w:tc>
+          <w:tcPr>
+            <w:tcW w:type="dxa" w:w="1200"/>
+            <w:tcBorders>
+              <w:top w:val="single" w:color="CCCCCC" w:sz="2"/>
+              <w:left w:val="none" w:color="FFFFFF" w:sz="0"/>
+              <w:bottom w:val="single" w:color="CCCCCC" w:sz="2"/>
+              <w:right w:val="none" w:color="FFFFFF" w:sz="0"/>
+            </w:tcBorders>
+            <w:tcMar>
+              <w:top w:type="dxa" w:w="60"/>
+              <w:left w:type="dxa" w:w="120"/>
+              <w:bottom w:type="dxa" w:w="60"/>
+              <w:right w:type="dxa" w:w="120"/>
+            </w:tcMar>
+          </w:tcPr>
+          <w:p>
+            <w:r>
+              <w:rPr>
+                <w:rFonts w:ascii="Calibri" w:cs="Calibri" w:eastAsia="Calibri" w:hAnsi="Calibri"/>
+                <w:b w:val="false"/>
+                <w:bCs w:val="false"/>
+                <w:sz w:val="18"/>
+                <w:szCs w:val="18"/>
+              </w:rPr>
+              <w:t xml:space="preserve">unités</w:t>
             </w:r>
           </w:p>
         </w:tc>
@@ -1019,7 +1356,7 @@
       <w:tr>
         <w:tc>
           <w:tcPr>
-            <w:tcW w:type="dxa" w:w="1200"/>
+            <w:tcW w:type="dxa" w:w="2000"/>
             <w:tcBorders>
               <w:top w:val="single" w:color="CCCCCC" w:sz="2"/>
               <w:left w:val="none" w:color="FFFFFF" w:sz="0"/>
@@ -1042,13 +1379,13 @@
                 <w:sz w:val="18"/>
                 <w:szCs w:val="18"/>
               </w:rPr>
-              <w:t xml:space="preserve">14:00</w:t>
-            </w:r>
-          </w:p>
-        </w:tc>
-        <w:tc>
-          <w:tcPr>
-            <w:tcW w:type="dxa" w:w="6270"/>
+              <w:t xml:space="preserve">Sous-traitant A</w:t>
+            </w:r>
+          </w:p>
+        </w:tc>
+        <w:tc>
+          <w:tcPr>
+            <w:tcW w:type="dxa" w:w="1600"/>
             <w:tcBorders>
               <w:top w:val="single" w:color="CCCCCC" w:sz="2"/>
               <w:left w:val="none" w:color="FFFFFF" w:sz="0"/>
@@ -1071,13 +1408,13 @@
                 <w:sz w:val="18"/>
                 <w:szCs w:val="18"/>
               </w:rPr>
-              <w:t xml:space="preserve">Excavation tranchée</w:t>
-            </w:r>
-          </w:p>
-        </w:tc>
-        <w:tc>
-          <w:tcPr>
-            <w:tcW w:type="dxa" w:w="1600"/>
+              <w:t xml:space="preserve">Excavation</w:t>
+            </w:r>
+          </w:p>
+        </w:tc>
+        <w:tc>
+          <w:tcPr>
+            <w:tcW w:type="dxa" w:w="3270"/>
             <w:tcBorders>
               <w:top w:val="single" w:color="CCCCCC" w:sz="2"/>
               <w:left w:val="none" w:color="FFFFFF" w:sz="0"/>
@@ -1100,7 +1437,65 @@
                 <w:sz w:val="18"/>
                 <w:szCs w:val="18"/>
               </w:rPr>
-              <w:t xml:space="preserve">18 m³</w:t>
+              <w:t xml:space="preserve">Tranchée rue Boyer</w:t>
+            </w:r>
+          </w:p>
+        </w:tc>
+        <w:tc>
+          <w:tcPr>
+            <w:tcW w:type="dxa" w:w="1000"/>
+            <w:tcBorders>
+              <w:top w:val="single" w:color="CCCCCC" w:sz="2"/>
+              <w:left w:val="none" w:color="FFFFFF" w:sz="0"/>
+              <w:bottom w:val="single" w:color="CCCCCC" w:sz="2"/>
+              <w:right w:val="none" w:color="FFFFFF" w:sz="0"/>
+            </w:tcBorders>
+            <w:tcMar>
+              <w:top w:type="dxa" w:w="60"/>
+              <w:left w:type="dxa" w:w="120"/>
+              <w:bottom w:type="dxa" w:w="60"/>
+              <w:right w:type="dxa" w:w="120"/>
+            </w:tcMar>
+          </w:tcPr>
+          <w:p>
+            <w:r>
+              <w:rPr>
+                <w:rFonts w:ascii="Calibri" w:cs="Calibri" w:eastAsia="Calibri" w:hAnsi="Calibri"/>
+                <w:b w:val="false"/>
+                <w:bCs w:val="false"/>
+                <w:sz w:val="18"/>
+                <w:szCs w:val="18"/>
+              </w:rPr>
+              <w:t xml:space="preserve">18</w:t>
+            </w:r>
+          </w:p>
+        </w:tc>
+        <w:tc>
+          <w:tcPr>
+            <w:tcW w:type="dxa" w:w="1200"/>
+            <w:tcBorders>
+              <w:top w:val="single" w:color="CCCCCC" w:sz="2"/>
+              <w:left w:val="none" w:color="FFFFFF" w:sz="0"/>
+              <w:bottom w:val="single" w:color="CCCCCC" w:sz="2"/>
+              <w:right w:val="none" w:color="FFFFFF" w:sz="0"/>
+            </w:tcBorders>
+            <w:tcMar>
+              <w:top w:type="dxa" w:w="60"/>
+              <w:left w:type="dxa" w:w="120"/>
+              <w:bottom w:type="dxa" w:w="60"/>
+              <w:right w:type="dxa" w:w="120"/>
+            </w:tcMar>
+          </w:tcPr>
+          <w:p>
+            <w:r>
+              <w:rPr>
+                <w:rFonts w:ascii="Calibri" w:cs="Calibri" w:eastAsia="Calibri" w:hAnsi="Calibri"/>
+                <w:b w:val="false"/>
+                <w:bCs w:val="false"/>
+                <w:sz w:val="18"/>
+                <w:szCs w:val="18"/>
+              </w:rPr>
+              <w:t xml:space="preserve">m³</w:t>
             </w:r>
           </w:p>
         </w:tc>
@@ -1108,7 +1503,7 @@
       <w:tr>
         <w:tc>
           <w:tcPr>
-            <w:tcW w:type="dxa" w:w="1200"/>
+            <w:tcW w:type="dxa" w:w="2000"/>
             <w:tcBorders>
               <w:top w:val="single" w:color="CCCCCC" w:sz="2"/>
               <w:left w:val="none" w:color="FFFFFF" w:sz="0"/>
@@ -1138,7 +1533,7 @@
         </w:tc>
         <w:tc>
           <w:tcPr>
-            <w:tcW w:type="dxa" w:w="6270"/>
+            <w:tcW w:type="dxa" w:w="1600"/>
             <w:tcBorders>
               <w:top w:val="single" w:color="CCCCCC" w:sz="2"/>
               <w:left w:val="none" w:color="FFFFFF" w:sz="0"/>
@@ -1162,13 +1557,13 @@
                 <w:sz w:val="18"/>
                 <w:szCs w:val="18"/>
               </w:rPr>
-              <w:t xml:space="preserve">TOTAL</w:t>
-            </w:r>
-          </w:p>
-        </w:tc>
-        <w:tc>
-          <w:tcPr>
-            <w:tcW w:type="dxa" w:w="1600"/>
+              <w:t xml:space="preserve"/>
+            </w:r>
+          </w:p>
+        </w:tc>
+        <w:tc>
+          <w:tcPr>
+            <w:tcW w:type="dxa" w:w="3270"/>
             <w:tcBorders>
               <w:top w:val="single" w:color="CCCCCC" w:sz="2"/>
               <w:left w:val="none" w:color="FFFFFF" w:sz="0"/>
@@ -1192,6 +1587,66 @@
                 <w:sz w:val="18"/>
                 <w:szCs w:val="18"/>
               </w:rPr>
+              <w:t xml:space="preserve">TOTAL</w:t>
+            </w:r>
+          </w:p>
+        </w:tc>
+        <w:tc>
+          <w:tcPr>
+            <w:tcW w:type="dxa" w:w="1000"/>
+            <w:tcBorders>
+              <w:top w:val="single" w:color="CCCCCC" w:sz="2"/>
+              <w:left w:val="none" w:color="FFFFFF" w:sz="0"/>
+              <w:bottom w:val="single" w:color="CCCCCC" w:sz="2"/>
+              <w:right w:val="none" w:color="FFFFFF" w:sz="0"/>
+            </w:tcBorders>
+            <w:shd w:fill="F0F0F0" w:val="clear"/>
+            <w:tcMar>
+              <w:top w:type="dxa" w:w="60"/>
+              <w:left w:type="dxa" w:w="120"/>
+              <w:bottom w:type="dxa" w:w="60"/>
+              <w:right w:type="dxa" w:w="120"/>
+            </w:tcMar>
+          </w:tcPr>
+          <w:p>
+            <w:r>
+              <w:rPr>
+                <w:rFonts w:ascii="Calibri" w:cs="Calibri" w:eastAsia="Calibri" w:hAnsi="Calibri"/>
+                <w:b/>
+                <w:bCs/>
+                <w:sz w:val="18"/>
+                <w:szCs w:val="18"/>
+              </w:rPr>
+              <w:t xml:space="preserve"/>
+            </w:r>
+          </w:p>
+        </w:tc>
+        <w:tc>
+          <w:tcPr>
+            <w:tcW w:type="dxa" w:w="1200"/>
+            <w:tcBorders>
+              <w:top w:val="single" w:color="CCCCCC" w:sz="2"/>
+              <w:left w:val="none" w:color="FFFFFF" w:sz="0"/>
+              <w:bottom w:val="single" w:color="CCCCCC" w:sz="2"/>
+              <w:right w:val="none" w:color="FFFFFF" w:sz="0"/>
+            </w:tcBorders>
+            <w:shd w:fill="F0F0F0" w:val="clear"/>
+            <w:tcMar>
+              <w:top w:type="dxa" w:w="60"/>
+              <w:left w:type="dxa" w:w="120"/>
+              <w:bottom w:type="dxa" w:w="60"/>
+              <w:right w:type="dxa" w:w="120"/>
+            </w:tcMar>
+          </w:tcPr>
+          <w:p>
+            <w:r>
+              <w:rPr>
+                <w:rFonts w:ascii="Calibri" w:cs="Calibri" w:eastAsia="Calibri" w:hAnsi="Calibri"/>
+                <w:b/>
+                <w:bCs/>
+                <w:sz w:val="18"/>
+                <w:szCs w:val="18"/>
+              </w:rPr>
               <w:t xml:space="preserve"/>
             </w:r>
           </w:p>
@@ -1203,6 +1658,344 @@
         <w:spacing w:after="0" w:before="200"/>
       </w:pPr>
     </w:p>
+    <w:p>
+      <w:r>
+        <w:br w:type="page"/>
+      </w:r>
+    </w:p>
+    <w:tbl>
+      <w:tblPr>
+        <w:tblW w:type="dxa" w:w="9070"/>
+        <w:tblBorders>
+          <w:top w:val="single" w:color="auto" w:sz="4"/>
+          <w:left w:val="single" w:color="auto" w:sz="4"/>
+          <w:bottom w:val="single" w:color="auto" w:sz="4"/>
+          <w:right w:val="single" w:color="auto" w:sz="4"/>
+          <w:insideH w:val="single" w:color="auto" w:sz="4"/>
+          <w:insideV w:val="single" w:color="auto" w:sz="4"/>
+        </w:tblBorders>
+      </w:tblPr>
+      <w:tblGrid>
+        <w:gridCol w:w="9070"/>
+      </w:tblGrid>
+      <w:tr>
+        <w:tc>
+          <w:tcPr>
+            <w:tcW w:type="dxa" w:w="9070"/>
+            <w:tcBorders>
+              <w:top w:val="none" w:color="FFFFFF" w:sz="0"/>
+              <w:left w:val="none" w:color="FFFFFF" w:sz="0"/>
+              <w:bottom w:val="none" w:color="FFFFFF" w:sz="0"/>
+              <w:right w:val="none" w:color="FFFFFF" w:sz="0"/>
+            </w:tcBorders>
+            <w:shd w:fill="1B2A4A" w:val="clear"/>
+            <w:tcMar>
+              <w:top w:type="dxa" w:w="100"/>
+              <w:left w:type="dxa" w:w="180"/>
+              <w:bottom w:type="dxa" w:w="100"/>
+              <w:right w:type="dxa" w:w="180"/>
+            </w:tcMar>
+          </w:tcPr>
+          <w:p>
+            <w:r>
+              <w:rPr>
+                <w:rFonts w:ascii="Calibri" w:cs="Calibri" w:eastAsia="Calibri" w:hAnsi="Calibri"/>
+                <w:b/>
+                <w:bCs/>
+                <w:color w:val="FFFFFF"/>
+                <w:sz w:val="22"/>
+                <w:szCs w:val="22"/>
+              </w:rPr>
+              <w:t xml:space="preserve">ANNEXE A — PHOTOS ÉVÉNEMENT 2.1 Bris de conduite souterraine</w:t>
+            </w:r>
+          </w:p>
+        </w:tc>
+      </w:tr>
+    </w:tbl>
+    <w:p>
+      <w:pPr>
+        <w:spacing w:after="0" w:before="120"/>
+      </w:pPr>
+    </w:p>
+    <w:tbl>
+      <w:tblPr>
+        <w:tblW w:type="dxa" w:w="9070"/>
+        <w:tblBorders>
+          <w:top w:val="single" w:color="auto" w:sz="4"/>
+          <w:left w:val="single" w:color="auto" w:sz="4"/>
+          <w:bottom w:val="single" w:color="auto" w:sz="4"/>
+          <w:right w:val="single" w:color="auto" w:sz="4"/>
+          <w:insideH w:val="single" w:color="auto" w:sz="4"/>
+          <w:insideV w:val="single" w:color="auto" w:sz="4"/>
+        </w:tblBorders>
+      </w:tblPr>
+      <w:tblGrid>
+        <w:gridCol w:w="3200"/>
+        <w:gridCol w:w="2670"/>
+        <w:gridCol w:w="3200"/>
+      </w:tblGrid>
+      <w:tr>
+        <w:trPr>
+          <w:trHeight w:val="3200" w:hRule="exact"/>
+        </w:trPr>
+        <w:tc>
+          <w:tcPr>
+            <w:tcW w:type="dxa" w:w="3200"/>
+            <w:tcBorders>
+              <w:top w:val="single" w:color="CCCCCC" w:sz="4"/>
+              <w:left w:val="single" w:color="CCCCCC" w:sz="4"/>
+              <w:bottom w:val="single" w:color="CCCCCC" w:sz="4"/>
+              <w:right w:val="single" w:color="CCCCCC" w:sz="4"/>
+            </w:tcBorders>
+            <w:shd w:fill="F5F5F5" w:val="clear"/>
+            <w:tcMar>
+              <w:top w:type="dxa" w:w="200"/>
+              <w:left w:type="dxa" w:w="200"/>
+              <w:bottom w:type="dxa" w:w="200"/>
+              <w:right w:type="dxa" w:w="200"/>
+            </w:tcMar>
+            <w:vAlign w:val="center"/>
+          </w:tcPr>
+          <w:p>
+            <w:pPr>
+              <w:jc w:val="center"/>
+            </w:pPr>
+            <w:r>
+              <w:rPr>
+                <w:rFonts w:ascii="Calibri" w:cs="Calibri" w:eastAsia="Calibri" w:hAnsi="Calibri"/>
+                <w:i/>
+                <w:iCs/>
+                <w:color w:val="666666"/>
+                <w:sz w:val="18"/>
+                <w:szCs w:val="18"/>
+              </w:rPr>
+              <w:t xml:space="preserve">Photo 1</w:t>
+            </w:r>
+          </w:p>
+        </w:tc>
+        <w:tc>
+          <w:tcPr>
+            <w:tcW w:type="dxa" w:w="2670"/>
+            <w:tcBorders>
+              <w:top w:val="none" w:color="FFFFFF" w:sz="0"/>
+              <w:left w:val="none" w:color="FFFFFF" w:sz="0"/>
+              <w:bottom w:val="none" w:color="FFFFFF" w:sz="0"/>
+              <w:right w:val="none" w:color="FFFFFF" w:sz="0"/>
+            </w:tcBorders>
+          </w:tcPr>
+          <w:p/>
+        </w:tc>
+        <w:tc>
+          <w:tcPr>
+            <w:tcW w:type="dxa" w:w="3200"/>
+            <w:tcBorders>
+              <w:top w:val="single" w:color="CCCCCC" w:sz="4"/>
+              <w:left w:val="single" w:color="CCCCCC" w:sz="4"/>
+              <w:bottom w:val="single" w:color="CCCCCC" w:sz="4"/>
+              <w:right w:val="single" w:color="CCCCCC" w:sz="4"/>
+            </w:tcBorders>
+            <w:shd w:fill="F5F5F5" w:val="clear"/>
+            <w:tcMar>
+              <w:top w:type="dxa" w:w="200"/>
+              <w:left w:type="dxa" w:w="200"/>
+              <w:bottom w:type="dxa" w:w="200"/>
+              <w:right w:type="dxa" w:w="200"/>
+            </w:tcMar>
+            <w:vAlign w:val="center"/>
+          </w:tcPr>
+          <w:p>
+            <w:pPr>
+              <w:jc w:val="center"/>
+            </w:pPr>
+            <w:r>
+              <w:rPr>
+                <w:rFonts w:ascii="Calibri" w:cs="Calibri" w:eastAsia="Calibri" w:hAnsi="Calibri"/>
+                <w:i/>
+                <w:iCs/>
+                <w:color w:val="666666"/>
+                <w:sz w:val="18"/>
+                <w:szCs w:val="18"/>
+              </w:rPr>
+              <w:t xml:space="preserve">Photo 2</w:t>
+            </w:r>
+          </w:p>
+        </w:tc>
+      </w:tr>
+      <w:tr>
+        <w:trPr>
+          <w:trHeight w:val="3200" w:hRule="exact"/>
+        </w:trPr>
+        <w:tc>
+          <w:tcPr>
+            <w:tcW w:type="dxa" w:w="3200"/>
+            <w:tcBorders>
+              <w:top w:val="single" w:color="CCCCCC" w:sz="4"/>
+              <w:left w:val="single" w:color="CCCCCC" w:sz="4"/>
+              <w:bottom w:val="single" w:color="CCCCCC" w:sz="4"/>
+              <w:right w:val="single" w:color="CCCCCC" w:sz="4"/>
+            </w:tcBorders>
+            <w:shd w:fill="F5F5F5" w:val="clear"/>
+            <w:tcMar>
+              <w:top w:type="dxa" w:w="200"/>
+              <w:left w:type="dxa" w:w="200"/>
+              <w:bottom w:type="dxa" w:w="200"/>
+              <w:right w:type="dxa" w:w="200"/>
+            </w:tcMar>
+            <w:vAlign w:val="center"/>
+          </w:tcPr>
+          <w:p>
+            <w:pPr>
+              <w:jc w:val="center"/>
+            </w:pPr>
+            <w:r>
+              <w:rPr>
+                <w:rFonts w:ascii="Calibri" w:cs="Calibri" w:eastAsia="Calibri" w:hAnsi="Calibri"/>
+                <w:i/>
+                <w:iCs/>
+                <w:color w:val="666666"/>
+                <w:sz w:val="18"/>
+                <w:szCs w:val="18"/>
+              </w:rPr>
+              <w:t xml:space="preserve">Photo 3</w:t>
+            </w:r>
+          </w:p>
+        </w:tc>
+        <w:tc>
+          <w:tcPr>
+            <w:tcW w:type="dxa" w:w="2670"/>
+            <w:tcBorders>
+              <w:top w:val="none" w:color="FFFFFF" w:sz="0"/>
+              <w:left w:val="none" w:color="FFFFFF" w:sz="0"/>
+              <w:bottom w:val="none" w:color="FFFFFF" w:sz="0"/>
+              <w:right w:val="none" w:color="FFFFFF" w:sz="0"/>
+            </w:tcBorders>
+          </w:tcPr>
+          <w:p/>
+        </w:tc>
+        <w:tc>
+          <w:tcPr>
+            <w:tcW w:type="dxa" w:w="3200"/>
+            <w:tcBorders>
+              <w:top w:val="single" w:color="CCCCCC" w:sz="4"/>
+              <w:left w:val="single" w:color="CCCCCC" w:sz="4"/>
+              <w:bottom w:val="single" w:color="CCCCCC" w:sz="4"/>
+              <w:right w:val="single" w:color="CCCCCC" w:sz="4"/>
+            </w:tcBorders>
+            <w:shd w:fill="F5F5F5" w:val="clear"/>
+            <w:tcMar>
+              <w:top w:type="dxa" w:w="200"/>
+              <w:left w:type="dxa" w:w="200"/>
+              <w:bottom w:type="dxa" w:w="200"/>
+              <w:right w:type="dxa" w:w="200"/>
+            </w:tcMar>
+            <w:vAlign w:val="center"/>
+          </w:tcPr>
+          <w:p>
+            <w:pPr>
+              <w:jc w:val="center"/>
+            </w:pPr>
+            <w:r>
+              <w:rPr>
+                <w:rFonts w:ascii="Calibri" w:cs="Calibri" w:eastAsia="Calibri" w:hAnsi="Calibri"/>
+                <w:i/>
+                <w:iCs/>
+                <w:color w:val="666666"/>
+                <w:sz w:val="18"/>
+                <w:szCs w:val="18"/>
+              </w:rPr>
+              <w:t xml:space="preserve">Photo 4</w:t>
+            </w:r>
+          </w:p>
+        </w:tc>
+      </w:tr>
+      <w:tr>
+        <w:trPr>
+          <w:trHeight w:val="3200" w:hRule="exact"/>
+        </w:trPr>
+        <w:tc>
+          <w:tcPr>
+            <w:tcW w:type="dxa" w:w="3200"/>
+            <w:tcBorders>
+              <w:top w:val="single" w:color="CCCCCC" w:sz="4"/>
+              <w:left w:val="single" w:color="CCCCCC" w:sz="4"/>
+              <w:bottom w:val="single" w:color="CCCCCC" w:sz="4"/>
+              <w:right w:val="single" w:color="CCCCCC" w:sz="4"/>
+            </w:tcBorders>
+            <w:shd w:fill="F5F5F5" w:val="clear"/>
+            <w:tcMar>
+              <w:top w:type="dxa" w:w="200"/>
+              <w:left w:type="dxa" w:w="200"/>
+              <w:bottom w:type="dxa" w:w="200"/>
+              <w:right w:type="dxa" w:w="200"/>
+            </w:tcMar>
+            <w:vAlign w:val="center"/>
+          </w:tcPr>
+          <w:p>
+            <w:pPr>
+              <w:jc w:val="center"/>
+            </w:pPr>
+            <w:r>
+              <w:rPr>
+                <w:rFonts w:ascii="Calibri" w:cs="Calibri" w:eastAsia="Calibri" w:hAnsi="Calibri"/>
+                <w:i/>
+                <w:iCs/>
+                <w:color w:val="666666"/>
+                <w:sz w:val="18"/>
+                <w:szCs w:val="18"/>
+              </w:rPr>
+              <w:t xml:space="preserve">Photo 5</w:t>
+            </w:r>
+          </w:p>
+        </w:tc>
+        <w:tc>
+          <w:tcPr>
+            <w:tcW w:type="dxa" w:w="2670"/>
+            <w:tcBorders>
+              <w:top w:val="none" w:color="FFFFFF" w:sz="0"/>
+              <w:left w:val="none" w:color="FFFFFF" w:sz="0"/>
+              <w:bottom w:val="none" w:color="FFFFFF" w:sz="0"/>
+              <w:right w:val="none" w:color="FFFFFF" w:sz="0"/>
+            </w:tcBorders>
+          </w:tcPr>
+          <w:p/>
+        </w:tc>
+        <w:tc>
+          <w:tcPr>
+            <w:tcW w:type="dxa" w:w="3200"/>
+            <w:tcBorders>
+              <w:top w:val="single" w:color="CCCCCC" w:sz="4"/>
+              <w:left w:val="single" w:color="CCCCCC" w:sz="4"/>
+              <w:bottom w:val="single" w:color="CCCCCC" w:sz="4"/>
+              <w:right w:val="single" w:color="CCCCCC" w:sz="4"/>
+            </w:tcBorders>
+            <w:shd w:fill="F5F5F5" w:val="clear"/>
+            <w:tcMar>
+              <w:top w:type="dxa" w:w="200"/>
+              <w:left w:type="dxa" w:w="200"/>
+              <w:bottom w:type="dxa" w:w="200"/>
+              <w:right w:type="dxa" w:w="200"/>
+            </w:tcMar>
+            <w:vAlign w:val="center"/>
+          </w:tcPr>
+          <w:p>
+            <w:pPr>
+              <w:jc w:val="center"/>
+            </w:pPr>
+            <w:r>
+              <w:rPr>
+                <w:rFonts w:ascii="Calibri" w:cs="Calibri" w:eastAsia="Calibri" w:hAnsi="Calibri"/>
+                <w:i/>
+                <w:iCs/>
+                <w:color w:val="666666"/>
+                <w:sz w:val="18"/>
+                <w:szCs w:val="18"/>
+              </w:rPr>
+              <w:t xml:space="preserve">Photo 6</w:t>
+            </w:r>
+          </w:p>
+        </w:tc>
+      </w:tr>
+    </w:tbl>
     <w:sectPr>
       <w:footerReference w:type="default" r:id="rId7"/>
       <w:pgSz w:w="11906" w:h="16838" w:orient="portrait"/>

</xml_diff>

<commit_message>
v2.3.0 — documentation complète + onboarding Éric
- README mis à jour (structure réelle, scripts, déploiement)
- ARCHITECTURE.md : diagramme système, schéma DB, décisions
- ROADMAP.md : Phase 1 livrée, Phase 2-4 planifiées
- BUG-LOG.md : 6 bugs documentés, 5 dettes techniques
- onboarding-eric.md + .pdf : guide installation travailleur
- logo-maestro.jpeg ajouté aux assets
- generate-rapport.js : corrections logo JPEG, adresse inline, colonnes Section 3

Co-Authored-By: Claude Sonnet 4.6 <noreply@anthropic.com>
</commit_message>
<xml_diff>
--- a/assets/rapport-template.docx
+++ b/assets/rapport-template.docx
@@ -36,44 +36,137 @@
             </w:tcMar>
             <w:vAlign w:val="top"/>
           </w:tcPr>
-          <w:p>
-            <w:r>
-              <w:rPr>
-                <w:rFonts w:ascii="Calibri" w:cs="Calibri" w:eastAsia="Calibri" w:hAnsi="Calibri"/>
-                <w:b/>
-                <w:bCs/>
-                <w:color w:val="1B2A4A"/>
-                <w:sz w:val="24"/>
-                <w:szCs w:val="24"/>
-              </w:rPr>
-              <w:t xml:space="preserve">[LOGO MAESTRO MOBILITÉ]</w:t>
-            </w:r>
-          </w:p>
-          <w:p>
-            <w:pPr>
-              <w:spacing w:before="60"/>
-            </w:pPr>
-            <w:r>
-              <w:rPr>
-                <w:rFonts w:ascii="Calibri" w:cs="Calibri" w:eastAsia="Calibri" w:hAnsi="Calibri"/>
-                <w:color w:val="666666"/>
-                <w:sz w:val="16"/>
-                <w:szCs w:val="16"/>
-              </w:rPr>
-              <w:t xml:space="preserve">7441 rue Boyer</w:t>
-            </w:r>
-          </w:p>
-          <w:p>
-            <w:r>
-              <w:rPr>
-                <w:rFonts w:ascii="Calibri" w:cs="Calibri" w:eastAsia="Calibri" w:hAnsi="Calibri"/>
-                <w:color w:val="666666"/>
-                <w:sz w:val="16"/>
-                <w:szCs w:val="16"/>
-              </w:rPr>
-              <w:t xml:space="preserve">Montréal, Québec, H2R 2R9</w:t>
-            </w:r>
-          </w:p>
+          <w:tbl>
+            <w:tblPr>
+              <w:tblW w:type="dxa" w:w="3628"/>
+              <w:tblBorders>
+                <w:top w:val="single" w:color="auto" w:sz="4"/>
+                <w:left w:val="single" w:color="auto" w:sz="4"/>
+                <w:bottom w:val="single" w:color="auto" w:sz="4"/>
+                <w:right w:val="single" w:color="auto" w:sz="4"/>
+                <w:insideH w:val="single" w:color="auto" w:sz="4"/>
+                <w:insideV w:val="single" w:color="auto" w:sz="4"/>
+              </w:tblBorders>
+            </w:tblPr>
+            <w:tblGrid>
+              <w:gridCol w:w="1500"/>
+              <w:gridCol w:w="2128"/>
+            </w:tblGrid>
+            <w:tr>
+              <w:tc>
+                <w:tcPr>
+                  <w:tcW w:type="dxa" w:w="1500"/>
+                  <w:tcBorders>
+                    <w:top w:val="none" w:color="FFFFFF" w:sz="0"/>
+                    <w:left w:val="none" w:color="FFFFFF" w:sz="0"/>
+                    <w:bottom w:val="none" w:color="FFFFFF" w:sz="0"/>
+                    <w:right w:val="none" w:color="FFFFFF" w:sz="0"/>
+                  </w:tcBorders>
+                  <w:tcMar>
+                    <w:top w:type="dxa" w:w="0"/>
+                    <w:left w:type="dxa" w:w="0"/>
+                    <w:bottom w:type="dxa" w:w="0"/>
+                    <w:right w:type="dxa" w:w="120"/>
+                  </w:tcMar>
+                  <w:vAlign w:val="center"/>
+                </w:tcPr>
+                <w:p>
+                  <w:r>
+                    <w:drawing>
+                      <wp:inline distT="0" distB="0" distL="0" distR="0">
+                        <wp:extent cx="1076325" cy="1057275"/>
+                        <wp:effectExtent t="0" r="0" b="0" l="0"/>
+                        <wp:docPr id="1" name="logo-maestro" descr="Logo" title="Maestro Mobilité"/>
+                        <wp:cNvGraphicFramePr>
+                          <a:graphicFrameLocks xmlns:a="http://schemas.openxmlformats.org/drawingml/2006/main" noChangeAspect="1"/>
+                        </wp:cNvGraphicFramePr>
+                        <a:graphic xmlns:a="http://schemas.openxmlformats.org/drawingml/2006/main">
+                          <a:graphicData uri="http://schemas.openxmlformats.org/drawingml/2006/picture">
+                            <pic:pic xmlns:pic="http://schemas.openxmlformats.org/drawingml/2006/picture">
+                              <pic:nvPicPr>
+                                <pic:cNvPr id="0" name="" descr=""/>
+                                <pic:cNvPicPr>
+                                  <a:picLocks noChangeAspect="1" noChangeArrowheads="1"/>
+                                </pic:cNvPicPr>
+                              </pic:nvPicPr>
+                              <pic:blipFill>
+                                <a:blip r:embed="rId8" cstate="none"/>
+                                <a:srcRect/>
+                                <a:stretch>
+                                  <a:fillRect/>
+                                </a:stretch>
+                              </pic:blipFill>
+                              <pic:spPr bwMode="auto">
+                                <a:xfrm>
+                                  <a:off x="0" y="0"/>
+                                  <a:ext cx="1076325" cy="1057275"/>
+                                </a:xfrm>
+                                <a:prstGeom prst="rect">
+                                  <a:avLst/>
+                                </a:prstGeom>
+                              </pic:spPr>
+                            </pic:pic>
+                          </a:graphicData>
+                        </a:graphic>
+                      </wp:inline>
+                    </w:drawing>
+                  </w:r>
+                </w:p>
+              </w:tc>
+              <w:tc>
+                <w:tcPr>
+                  <w:tcW w:type="dxa" w:w="2128"/>
+                  <w:tcBorders>
+                    <w:top w:val="none" w:color="FFFFFF" w:sz="0"/>
+                    <w:left w:val="none" w:color="FFFFFF" w:sz="0"/>
+                    <w:bottom w:val="none" w:color="FFFFFF" w:sz="0"/>
+                    <w:right w:val="none" w:color="FFFFFF" w:sz="0"/>
+                  </w:tcBorders>
+                  <w:tcMar>
+                    <w:top w:type="dxa" w:w="0"/>
+                    <w:left w:type="dxa" w:w="0"/>
+                    <w:bottom w:type="dxa" w:w="0"/>
+                    <w:right w:type="dxa" w:w="0"/>
+                  </w:tcMar>
+                  <w:vAlign w:val="top"/>
+                </w:tcPr>
+                <w:p>
+                  <w:r>
+                    <w:rPr>
+                      <w:rFonts w:ascii="Calibri" w:cs="Calibri" w:eastAsia="Calibri" w:hAnsi="Calibri"/>
+                      <w:color w:val="666666"/>
+                      <w:sz w:val="16"/>
+                      <w:szCs w:val="16"/>
+                    </w:rPr>
+                    <w:t xml:space="preserve">7441 rue Boyer</w:t>
+                  </w:r>
+                </w:p>
+                <w:p>
+                  <w:r>
+                    <w:rPr>
+                      <w:rFonts w:ascii="Calibri" w:cs="Calibri" w:eastAsia="Calibri" w:hAnsi="Calibri"/>
+                      <w:color w:val="666666"/>
+                      <w:sz w:val="16"/>
+                      <w:szCs w:val="16"/>
+                    </w:rPr>
+                    <w:t xml:space="preserve">Montréal, Québec</w:t>
+                  </w:r>
+                </w:p>
+                <w:p>
+                  <w:r>
+                    <w:rPr>
+                      <w:rFonts w:ascii="Calibri" w:cs="Calibri" w:eastAsia="Calibri" w:hAnsi="Calibri"/>
+                      <w:color w:val="666666"/>
+                      <w:sz w:val="16"/>
+                      <w:szCs w:val="16"/>
+                    </w:rPr>
+                    <w:t xml:space="preserve">H2R 2R9</w:t>
+                  </w:r>
+                </w:p>
+              </w:tc>
+            </w:tr>
+          </w:tbl>
+          <w:p/>
         </w:tc>
         <w:tc>
           <w:tcPr>
@@ -1999,7 +2092,7 @@
     <w:sectPr>
       <w:footerReference w:type="default" r:id="rId7"/>
       <w:pgSz w:w="11906" w:h="16838" w:orient="portrait"/>
-      <w:pgMar w:top="1418" w:right="1418" w:bottom="1418" w:left="1418" w:header="708" w:footer="708" w:gutter="0"/>
+      <w:pgMar w:top="720" w:right="1418" w:bottom="1418" w:left="1418" w:header="708" w:footer="708" w:gutter="0"/>
       <w:pgNumType/>
       <w:docGrid w:linePitch="360"/>
     </w:sectPr>
@@ -2079,7 +2172,9 @@
   </w:p>
   <w:p>
     <w:pPr>
-      <w:jc w:val="right"/>
+      <w:tabs>
+        <w:tab w:val="right" w:pos="9026"/>
+      </w:tabs>
     </w:pPr>
     <w:r>
       <w:rPr>
@@ -2089,6 +2184,47 @@
         <w:szCs w:val="14"/>
       </w:rPr>
       <w:t xml:space="preserve">Rapport généré par Maestro Mobilité</w:t>
+    </w:r>
+    <w:r>
+      <w:rPr>
+        <w:rFonts w:ascii="Calibri" w:cs="Calibri" w:eastAsia="Calibri" w:hAnsi="Calibri"/>
+        <w:sz w:val="14"/>
+        <w:szCs w:val="14"/>
+      </w:rPr>
+      <w:t xml:space="preserve">	</w:t>
+    </w:r>
+    <w:r>
+      <w:rPr>
+        <w:rFonts w:ascii="Calibri" w:cs="Calibri" w:eastAsia="Calibri" w:hAnsi="Calibri"/>
+        <w:color w:val="666666"/>
+        <w:sz w:val="14"/>
+        <w:szCs w:val="14"/>
+      </w:rPr>
+      <w:fldChar w:fldCharType="begin"/>
+      <w:instrText xml:space="preserve">PAGE</w:instrText>
+      <w:fldChar w:fldCharType="separate"/>
+      <w:fldChar w:fldCharType="end"/>
+    </w:r>
+    <w:r>
+      <w:rPr>
+        <w:rFonts w:ascii="Calibri" w:cs="Calibri" w:eastAsia="Calibri" w:hAnsi="Calibri"/>
+        <w:color w:val="666666"/>
+        <w:sz w:val="14"/>
+        <w:szCs w:val="14"/>
+      </w:rPr>
+      <w:t xml:space="preserve"> / </w:t>
+    </w:r>
+    <w:r>
+      <w:rPr>
+        <w:rFonts w:ascii="Calibri" w:cs="Calibri" w:eastAsia="Calibri" w:hAnsi="Calibri"/>
+        <w:color w:val="666666"/>
+        <w:sz w:val="14"/>
+        <w:szCs w:val="14"/>
+      </w:rPr>
+      <w:fldChar w:fldCharType="begin"/>
+      <w:instrText xml:space="preserve">NUMPAGES</w:instrText>
+      <w:fldChar w:fldCharType="separate"/>
+      <w:fldChar w:fldCharType="end"/>
     </w:r>
   </w:p>
 </w:ftr>

</xml_diff>